<commit_message>
Estilos mejorados, panel de administracion a medias, sistema de roles y poder añadir una mascota
</commit_message>
<xml_diff>
--- a/Memoria_TFG_AdrianBarreno.docx
+++ b/Memoria_TFG_AdrianBarreno.docx
@@ -896,7 +896,7 @@
           </mc:Choice>
           <mc:Fallback>
             <w:pict>
-              <v:group w14:anchorId="4BCA42FB" id="Group 1" o:spid="_x0000_s1026" style="position:absolute;margin-left:0;margin-top:0;width:346.45pt;height:201.95pt;z-index:-15770112;mso-wrap-distance-left:0;mso-wrap-distance-right:0;mso-position-horizontal-relative:page;mso-position-vertical-relative:page" coordsize="43999,25647" o:gfxdata="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">
+              <v:group w14:anchorId="09EFAF1F" id="Group 1" o:spid="_x0000_s1026" style="position:absolute;margin-left:0;margin-top:0;width:346.45pt;height:201.95pt;z-index:-15770112;mso-wrap-distance-left:0;mso-wrap-distance-right:0;mso-position-horizontal-relative:page;mso-position-vertical-relative:page" coordsize="43999,25647" o:gfxdata="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">
                 <v:shape id="Graphic 2" o:spid="_x0000_s1027" style="position:absolute;width:43999;height:25647;visibility:visible;mso-wrap-style:square;v-text-anchor:top" coordsize="4399915,2564765" o:gfxdata="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" path="m,2564164l,,4399639,r-7910,48983l4381011,95974r-13598,46310l4351013,187713r-19122,44345l4310123,275117r-24335,41570l4258964,356568,1955473,369347r-49954,1339l1855956,374520r-48947,6814l1758906,391606r-47032,14214l1666140,424456r-43793,24054l1581592,478168r-36811,34533l1512821,551378r-26203,42092l1467080,638246r-11968,46731l1451622,732932r5894,48450l1470527,823822r17399,41009l1506591,905483r16811,41367l1535076,989596r5475,43309l1540186,1076328r-5843,43089l1523381,1161721r-15719,41070l1487546,1242178r-24152,37254l1445324,1301946r-799715,l603240,1306647r-42289,12308l518370,1340801r-36643,29236l450813,1405543r-25395,40652l405335,1490874r-14980,47581l380269,1587819r-5400,50024l373945,1687405r2579,48923l381220,1785188r5986,48805l393654,1882751r6086,48719l404634,1980158r2878,48664l407545,2077470r-3638,48640l395830,2172790r-12805,45040l365800,2261067r-21333,41274l319333,2341492r-28625,36866l258902,2412778r-34679,31814l186982,2473638r-39495,26118l106048,2522785r-43074,19778l18574,2558930,,2564164xem3674721,637556r-49444,-1677l3575705,632102r-49655,-5638l3476355,619203r-49689,-8645l3377026,600770r-49546,-10694l3278071,578717,3131115,543034,2986324,509305r-96891,-20908l2792266,468833r-97430,-18147l2597153,434025r-97921,-15104l2401084,405446r-98363,-11776l2204156,383664r-98754,-8165l2055641,372236r-50052,-2211l1955473,369347r2293656,l4198165,430448r-33820,33596l4128350,495140r-38092,28395l4050146,549027r-42052,22386l3964180,590491r-45699,15567l3870338,618472r-48491,9118l3773050,633650r-49056,3242l3674721,637556xem1168132,1446768r-44255,-2162l1079032,1436633r-44500,-12200l990354,1409082r-43881,-17425l859507,1354885r-43133,-17195l773442,1322723r-42756,-11664l688083,1303775r-42474,-1829l1445324,1301946r-40902,43800l1370323,1373906r-36692,24230l1294705,1417987r-40799,15022l1211595,1442752r-43463,4016xe" fillcolor="#1a3c69" stroked="f">
                   <v:path arrowok="t"/>
                 </v:shape>
@@ -2351,7 +2351,7 @@
           </mc:Choice>
           <mc:Fallback>
             <w:pict>
-              <v:group w14:anchorId="07CDAE58" id="Group 4" o:spid="_x0000_s1026" style="position:absolute;margin-left:0;margin-top:226.7pt;width:595.5pt;height:615.6pt;z-index:-15769600;mso-wrap-distance-left:0;mso-wrap-distance-right:0;mso-position-horizontal-relative:page;mso-position-vertical-relative:page" coordsize="75628,78181" o:gfxdata="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">
+              <v:group w14:anchorId="44A47E15" id="Group 4" o:spid="_x0000_s1026" style="position:absolute;margin-left:0;margin-top:226.7pt;width:595.5pt;height:615.6pt;z-index:-15769600;mso-wrap-distance-left:0;mso-wrap-distance-right:0;mso-position-horizontal-relative:page;mso-position-vertical-relative:page" coordsize="75628,78181" o:gfxdata="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">
                 <v:shapetype id="_x0000_t75" coordsize="21600,21600" o:spt="75" o:preferrelative="t" path="m@4@5l@4@11@9@11@9@5xe" filled="f" stroked="f">
                   <v:stroke joinstyle="miter"/>
                   <v:formulas>
@@ -2520,7 +2520,6 @@
         </w:rPr>
         <w:t xml:space="preserve"> </w:t>
       </w:r>
-      <w:proofErr w:type="gramStart"/>
       <w:r>
         <w:rPr>
           <w:w w:val="120"/>
@@ -2540,7 +2539,6 @@
         </w:rPr>
         <w:t>D</w:t>
       </w:r>
-      <w:proofErr w:type="gramEnd"/>
       <w:r>
         <w:rPr>
           <w:spacing w:val="-61"/>
@@ -2713,14 +2711,12 @@
         </w:rPr>
         <w:t xml:space="preserve"> </w:t>
       </w:r>
-      <w:proofErr w:type="spellStart"/>
       <w:r>
         <w:rPr>
           <w:w w:val="105"/>
         </w:rPr>
-        <w:t>adopcion</w:t>
-      </w:r>
-      <w:proofErr w:type="spellEnd"/>
+        <w:t>adopción</w:t>
+      </w:r>
       <w:r>
         <w:rPr>
           <w:spacing w:val="-11"/>
@@ -2842,6 +2838,13 @@
     <w:p/>
     <w:sdt>
       <w:sdtPr>
+        <w:rPr>
+          <w:rFonts w:ascii="Tahoma" w:eastAsia="Tahoma" w:hAnsi="Tahoma" w:cs="Tahoma"/>
+          <w:color w:val="auto"/>
+          <w:sz w:val="22"/>
+          <w:szCs w:val="22"/>
+          <w:lang w:eastAsia="en-US"/>
+        </w:rPr>
         <w:id w:val="45353515"/>
         <w:docPartObj>
           <w:docPartGallery w:val="Table of Contents"/>
@@ -2850,13 +2853,8 @@
       </w:sdtPr>
       <w:sdtEndPr>
         <w:rPr>
-          <w:rFonts w:ascii="Tahoma" w:eastAsia="Tahoma" w:hAnsi="Tahoma" w:cs="Tahoma"/>
           <w:b/>
           <w:bCs/>
-          <w:color w:val="auto"/>
-          <w:sz w:val="22"/>
-          <w:szCs w:val="22"/>
-          <w:lang w:eastAsia="en-US"/>
         </w:rPr>
       </w:sdtEndPr>
       <w:sdtContent>
@@ -4676,6 +4674,7 @@
       </w:pPr>
       <w:bookmarkStart w:id="2" w:name="_Toc223343942"/>
       <w:r>
+        <w:lastRenderedPageBreak/>
         <w:t>DIAGRAMA ENTIDAD-RELACIÓN</w:t>
       </w:r>
       <w:bookmarkEnd w:id="2"/>

</xml_diff>